<commit_message>
Add SmartArt-style governance orgchart PNG and embed into Word document
Co-authored-by: Olayemi-katchon <170864752+Olayemi-katchon@users.noreply.github.com>
</commit_message>
<xml_diff>
--- a/PSIE_Evaluation.docx
+++ b/PSIE_Evaluation.docx
@@ -1932,6 +1932,111 @@
         <w:t>ANPE (Agence d'execution)</w:t>
         <w:br/>
         <w:t xml:space="preserve">  Plateforme numerique * Conseillers en emploi * Reseau 12 antennes departementales</w:t>
+      </w:r>
+    </w:p>
+    <w:p/>
+    <w:p>
+      <w:pPr>
+        <w:jc w:val="center"/>
+      </w:pPr>
+      <w:r>
+        <w:drawing>
+          <wp:inline xmlns:a="http://schemas.openxmlformats.org/drawingml/2006/main" xmlns:pic="http://schemas.openxmlformats.org/drawingml/2006/picture">
+            <wp:extent cx="5303520" cy="7361160"/>
+            <wp:docPr id="1" name="Picture 1"/>
+            <wp:cNvGraphicFramePr>
+              <a:graphicFrameLocks noChangeAspect="1"/>
+            </wp:cNvGraphicFramePr>
+            <a:graphic>
+              <a:graphicData uri="http://schemas.openxmlformats.org/drawingml/2006/picture">
+                <pic:pic>
+                  <pic:nvPicPr>
+                    <pic:cNvPr id="0" name="organigramme_gouvernance_PSIE.png"/>
+                    <pic:cNvPicPr/>
+                  </pic:nvPicPr>
+                  <pic:blipFill>
+                    <a:blip r:embed="rId9"/>
+                    <a:stretch>
+                      <a:fillRect/>
+                    </a:stretch>
+                  </pic:blipFill>
+                  <pic:spPr>
+                    <a:xfrm>
+                      <a:off x="0" y="0"/>
+                      <a:ext cx="5303520" cy="7361160"/>
+                    </a:xfrm>
+                    <a:prstGeom prst="rect"/>
+                  </pic:spPr>
+                </pic:pic>
+              </a:graphicData>
+            </a:graphic>
+          </wp:inline>
+        </w:drawing>
+      </w:r>
+    </w:p>
+    <w:p>
+      <w:pPr>
+        <w:jc w:val="center"/>
+      </w:pPr>
+      <w:r>
+        <w:rPr>
+          <w:i/>
+          <w:b/>
+          <w:sz w:val="18"/>
+          <w:color w:val="1A2F5A"/>
+        </w:rPr>
+        <w:t>Figure 1 : Structure institutionnelle de gouvernance du PSIE</w:t>
+      </w:r>
+    </w:p>
+    <w:p/>
+    <w:p>
+      <w:r>
+        <w:drawing>
+          <wp:inline xmlns:a="http://schemas.openxmlformats.org/drawingml/2006/main" xmlns:pic="http://schemas.openxmlformats.org/drawingml/2006/picture">
+            <wp:extent cx="5303520" cy="7361160"/>
+            <wp:docPr id="2" name="Picture 2"/>
+            <wp:cNvGraphicFramePr>
+              <a:graphicFrameLocks noChangeAspect="1"/>
+            </wp:cNvGraphicFramePr>
+            <a:graphic>
+              <a:graphicData uri="http://schemas.openxmlformats.org/drawingml/2006/picture">
+                <pic:pic>
+                  <pic:nvPicPr>
+                    <pic:cNvPr id="0" name="organigramme_gouvernance_PSIE.png"/>
+                    <pic:cNvPicPr/>
+                  </pic:nvPicPr>
+                  <pic:blipFill>
+                    <a:blip r:embed="rId10"/>
+                    <a:stretch>
+                      <a:fillRect/>
+                    </a:stretch>
+                  </pic:blipFill>
+                  <pic:spPr>
+                    <a:xfrm>
+                      <a:off x="0" y="0"/>
+                      <a:ext cx="5303520" cy="7361160"/>
+                    </a:xfrm>
+                    <a:prstGeom prst="rect"/>
+                  </pic:spPr>
+                </pic:pic>
+              </a:graphicData>
+            </a:graphic>
+          </wp:inline>
+        </w:drawing>
+      </w:r>
+    </w:p>
+    <w:p>
+      <w:pPr>
+        <w:jc w:val="center"/>
+      </w:pPr>
+      <w:r>
+        <w:rPr>
+          <w:i/>
+          <w:b/>
+          <w:sz w:val="18"/>
+          <w:color w:val="1A2F5A"/>
+        </w:rPr>
+        <w:t>Figure 1 : Structure institutionnelle de gouvernance du PSIE — République du Bénin</w:t>
       </w:r>
     </w:p>
     <w:p/>

</xml_diff>

<commit_message>
Replace table A (portée quantitative et géographique) with flowing prose in Word document
Co-authored-by: Olayemi-katchon <170864752+Olayemi-katchon@users.noreply.github.com>
</commit_message>
<xml_diff>
--- a/PSIE_Evaluation.docx
+++ b/PSIE_Evaluation.docx
@@ -3019,206 +3019,30 @@
         <w:t>A. Portee quantitative et geographique</w:t>
       </w:r>
     </w:p>
-    <w:tbl>
-      <w:tblPr>
-        <w:tblStyle w:val="TableGrid"/>
-        <w:tblW w:type="auto" w:w="0"/>
-        <w:tblLook w:firstColumn="1" w:firstRow="1" w:lastColumn="0" w:lastRow="0" w:noHBand="0" w:noVBand="1" w:val="04A0"/>
-      </w:tblPr>
-      <w:tblGrid>
-        <w:gridCol w:w="4618"/>
-        <w:gridCol w:w="4618"/>
-      </w:tblGrid>
-      <w:tr>
-        <w:tc>
-          <w:tcPr>
-            <w:tcW w:type="dxa" w:w="2835"/>
-            <w:shd w:val="clear" w:color="auto" w:fill="1F3864"/>
-          </w:tcPr>
-          <w:p>
-            <w:r>
-              <w:rPr>
-                <w:b/>
-                <w:color w:val="FFFFFF"/>
-                <w:sz w:val="19"/>
-              </w:rPr>
-              <w:t>Dimension</w:t>
-            </w:r>
-          </w:p>
-        </w:tc>
-        <w:tc>
-          <w:tcPr>
-            <w:tcW w:type="dxa" w:w="6803"/>
-            <w:shd w:val="clear" w:color="auto" w:fill="1F3864"/>
-          </w:tcPr>
-          <w:p>
-            <w:r>
-              <w:rPr>
-                <w:b/>
-                <w:color w:val="FFFFFF"/>
-                <w:sz w:val="19"/>
-              </w:rPr>
-              <w:t>Contenu</w:t>
-            </w:r>
-          </w:p>
-        </w:tc>
-      </w:tr>
-      <w:tr>
-        <w:tc>
-          <w:tcPr>
-            <w:tcW w:type="dxa" w:w="2835"/>
-            <w:shd w:val="clear" w:color="auto" w:fill="F2F2F2"/>
-          </w:tcPr>
-          <w:p>
-            <w:r>
-              <w:rPr>
-                <w:b/>
-                <w:sz w:val="19"/>
-              </w:rPr>
-              <w:t>Portee temporelle</w:t>
-            </w:r>
-          </w:p>
-        </w:tc>
-        <w:tc>
-          <w:tcPr>
-            <w:tcW w:type="dxa" w:w="6803"/>
-            <w:shd w:val="clear" w:color="auto" w:fill="F2F2F2"/>
-          </w:tcPr>
-          <w:p>
-            <w:r>
-              <w:rPr>
-                <w:sz w:val="19"/>
-              </w:rPr>
-              <w:t>5 ans de mise en oeuvre initiale (2020-2024), prolonge au-dela de 2025</w:t>
-            </w:r>
-          </w:p>
-        </w:tc>
-      </w:tr>
-      <w:tr>
-        <w:tc>
-          <w:tcPr>
-            <w:tcW w:type="dxa" w:w="2835"/>
-            <w:shd w:val="clear" w:color="auto" w:fill="FFFFFF"/>
-          </w:tcPr>
-          <w:p>
-            <w:r>
-              <w:rPr>
-                <w:b/>
-                <w:sz w:val="19"/>
-              </w:rPr>
-              <w:t>Portee cible (jeunes)</w:t>
-            </w:r>
-          </w:p>
-        </w:tc>
-        <w:tc>
-          <w:tcPr>
-            <w:tcW w:type="dxa" w:w="6803"/>
-            <w:shd w:val="clear" w:color="auto" w:fill="FFFFFF"/>
-          </w:tcPr>
-          <w:p>
-            <w:r>
-              <w:rPr>
-                <w:sz w:val="19"/>
-              </w:rPr>
-              <w:t>2 000 nouveaux beneficiaires/an ; cible initiale de 8 000 cumulee sur 5 ans</w:t>
-            </w:r>
-          </w:p>
-        </w:tc>
-      </w:tr>
-      <w:tr>
-        <w:tc>
-          <w:tcPr>
-            <w:tcW w:type="dxa" w:w="2835"/>
-            <w:shd w:val="clear" w:color="auto" w:fill="F2F2F2"/>
-          </w:tcPr>
-          <w:p>
-            <w:r>
-              <w:rPr>
-                <w:b/>
-                <w:sz w:val="19"/>
-              </w:rPr>
-              <w:t>Portee entreprises</w:t>
-            </w:r>
-          </w:p>
-        </w:tc>
-        <w:tc>
-          <w:tcPr>
-            <w:tcW w:type="dxa" w:w="6803"/>
-            <w:shd w:val="clear" w:color="auto" w:fill="F2F2F2"/>
-          </w:tcPr>
-          <w:p>
-            <w:r>
-              <w:rPr>
-                <w:sz w:val="19"/>
-              </w:rPr>
-              <w:t>Toutes entreprises formelles publiques et privees, toutes tailles</w:t>
-            </w:r>
-          </w:p>
-        </w:tc>
-      </w:tr>
-      <w:tr>
-        <w:tc>
-          <w:tcPr>
-            <w:tcW w:type="dxa" w:w="2835"/>
-            <w:shd w:val="clear" w:color="auto" w:fill="FFFFFF"/>
-          </w:tcPr>
-          <w:p>
-            <w:r>
-              <w:rPr>
-                <w:b/>
-                <w:sz w:val="19"/>
-              </w:rPr>
-              <w:t>Portee sectorielle</w:t>
-            </w:r>
-          </w:p>
-        </w:tc>
-        <w:tc>
-          <w:tcPr>
-            <w:tcW w:type="dxa" w:w="6803"/>
-            <w:shd w:val="clear" w:color="auto" w:fill="FFFFFF"/>
-          </w:tcPr>
-          <w:p>
-            <w:r>
-              <w:rPr>
-                <w:sz w:val="19"/>
-              </w:rPr>
-              <w:t>Tous secteurs formels (sauf emplois directs en sante, education, agriculture vivriere, artisanat)</w:t>
-            </w:r>
-          </w:p>
-        </w:tc>
-      </w:tr>
-      <w:tr>
-        <w:tc>
-          <w:tcPr>
-            <w:tcW w:type="dxa" w:w="2835"/>
-            <w:shd w:val="clear" w:color="auto" w:fill="F2F2F2"/>
-          </w:tcPr>
-          <w:p>
-            <w:r>
-              <w:rPr>
-                <w:b/>
-                <w:sz w:val="19"/>
-              </w:rPr>
-              <w:t>Portee geographique</w:t>
-            </w:r>
-          </w:p>
-        </w:tc>
-        <w:tc>
-          <w:tcPr>
-            <w:tcW w:type="dxa" w:w="6803"/>
-            <w:shd w:val="clear" w:color="auto" w:fill="F2F2F2"/>
-          </w:tcPr>
-          <w:p>
-            <w:r>
-              <w:rPr>
-                <w:sz w:val="19"/>
-              </w:rPr>
-              <w:t>12 departements du Benin - couverture nationale via antennes ANPE</w:t>
-            </w:r>
-          </w:p>
-        </w:tc>
-      </w:tr>
-    </w:tbl>
+    <w:p>
+      <w:r>
+        <w:rPr>
+          <w:sz w:val="24"/>
+        </w:rPr>
+        <w:t xml:space="preserve">Le PSIE a été conçu pour une mise en œuvre initiale de cinq ans, couvrant la période 2020–2024, avec une prolongation au-delà de 2025 compte tenu des résultats enregistrés et des besoins persistants. Sur le plan quantitatif, le programme vise l'insertion de 2 000 nouveaux bénéficiaires par an, soit une cible cumulative de 8 000 jeunes sur la durée initiale de cinq ans.</w:t>
+      </w:r>
+    </w:p>
+    <w:p>
+      <w:r>
+        <w:rPr>
+          <w:sz w:val="24"/>
+        </w:rPr>
+        <w:t xml:space="preserve">En ce qui concerne la portée entreprises, le PSIE s'adresse à l'ensemble des entreprises formelles, tant publiques que privées, sans distinction de taille : grandes entreprises, PME et petites structures sont toutes éligibles à accueillir des bénéficiaires. La portée sectorielle est également large, puisqu'elle couvre tous les secteurs de l'économie formelle, à l'exception des emplois directs relevant de la santé, de l'éducation, de l'agriculture vivrière et de l'artisanat traditionnel.</w:t>
+      </w:r>
+    </w:p>
+    <w:p>
+      <w:r>
+        <w:rPr>
+          <w:sz w:val="24"/>
+        </w:rPr>
+        <w:t xml:space="preserve">Enfin, sur le plan géographique, le programme déploie une couverture nationale à travers les douze départements du Bénin, rendue opérationnelle grâce au réseau des antennes départementales et locales de l'Agence Nationale pour l'Emploi (ANPE), qui constitue le principal bras opérationnel du dispositif sur le terrain.</w:t>
+      </w:r>
+    </w:p>
     <w:p/>
     <w:p>
       <w:pPr>

</xml_diff>

<commit_message>
Merge 3 effects tables into one unified table with vertical merges in Word document
Co-authored-by: Olayemi-katchon <170864752+Olayemi-katchon@users.noreply.github.com>
</commit_message>
<xml_diff>
--- a/PSIE_Evaluation.docx
+++ b/PSIE_Evaluation.docx
@@ -4495,41 +4495,68 @@
         <w:tblLook w:firstColumn="1" w:firstRow="1" w:lastColumn="0" w:lastRow="0" w:noHBand="0" w:noVBand="1" w:val="04A0"/>
       </w:tblPr>
       <w:tblGrid>
-        <w:gridCol w:w="4561"/>
-        <w:gridCol w:w="4561"/>
+        <w:gridCol w:w="3041"/>
+        <w:gridCol w:w="3041"/>
+        <w:gridCol w:w="3041"/>
       </w:tblGrid>
       <w:tr>
         <w:tc>
           <w:tcPr>
-            <w:tcW w:type="dxa" w:w="4561"/>
-            <w:shd w:val="clear" w:color="auto" w:fill="1A356E"/>
-          </w:tcPr>
-          <w:p>
-            <w:r/>
+            <w:tcW w:type="dxa" w:w="3041"/>
+            <w:tcW w:w="2381" w:type="dxa"/>
+            <w:shd w:val="clear" w:color="auto" w:fill="1F3864"/>
+          </w:tcPr>
+          <w:p>
+            <w:pPr>
+              <w:jc w:val="center"/>
+            </w:pPr>
             <w:r>
               <w:rPr>
                 <w:b/>
                 <w:color w:val="FFFFFF"/>
-                <w:sz w:val="19"/>
-              </w:rPr>
-              <w:t>Bénéficiaire</w:t>
-            </w:r>
-          </w:p>
-        </w:tc>
-        <w:tc>
-          <w:tcPr>
-            <w:tcW w:type="dxa" w:w="4561"/>
-            <w:shd w:val="clear" w:color="auto" w:fill="1A356E"/>
-          </w:tcPr>
-          <w:p>
-            <w:r/>
+                <w:sz w:val="22"/>
+              </w:rPr>
+              <w:t>Horizon temporel</w:t>
+            </w:r>
+          </w:p>
+        </w:tc>
+        <w:tc>
+          <w:tcPr>
+            <w:tcW w:type="dxa" w:w="3041"/>
+            <w:tcW w:w="2551" w:type="dxa"/>
+            <w:shd w:val="clear" w:color="auto" w:fill="1F3864"/>
+          </w:tcPr>
+          <w:p>
+            <w:pPr>
+              <w:jc w:val="center"/>
+            </w:pPr>
             <w:r>
               <w:rPr>
                 <w:b/>
                 <w:color w:val="FFFFFF"/>
-                <w:sz w:val="19"/>
-              </w:rPr>
-              <w:t>Effet attendu</w:t>
+                <w:sz w:val="22"/>
+              </w:rPr>
+              <w:t>Bénéficiaire / Niveau</w:t>
+            </w:r>
+          </w:p>
+        </w:tc>
+        <w:tc>
+          <w:tcPr>
+            <w:tcW w:type="dxa" w:w="3041"/>
+            <w:tcW w:w="5272" w:type="dxa"/>
+            <w:shd w:val="clear" w:color="auto" w:fill="1F3864"/>
+          </w:tcPr>
+          <w:p>
+            <w:pPr>
+              <w:jc w:val="center"/>
+            </w:pPr>
+            <w:r>
+              <w:rPr>
+                <w:b/>
+                <w:color w:val="FFFFFF"/>
+                <w:sz w:val="22"/>
+              </w:rPr>
+              <w:t>Effets et impacts attendus</w:t>
             </w:r>
           </w:p>
         </w:tc>
@@ -4537,14 +4564,41 @@
       <w:tr>
         <w:tc>
           <w:tcPr>
-            <w:tcW w:type="dxa" w:w="4561"/>
-          </w:tcPr>
-          <w:p>
-            <w:r/>
-            <w:r>
-              <w:rPr>
-                <w:color w:val="1A1A1A"/>
-                <w:sz w:val="19"/>
+            <w:tcW w:type="dxa" w:w="3041"/>
+            <w:tcW w:w="2381" w:type="dxa"/>
+            <w:shd w:val="clear" w:color="auto" w:fill="2E75B6"/>
+            <w:vMerge w:val="restart"/>
+          </w:tcPr>
+          <w:p>
+            <w:pPr>
+              <w:jc w:val="center"/>
+            </w:pPr>
+            <w:r>
+              <w:rPr>
+                <w:b/>
+                <w:color w:val="FFFFFF"/>
+                <w:sz w:val="20"/>
+              </w:rPr>
+              <w:t>Court terme</w:t>
+              <w:br/>
+              <w:t>(pendant les 24 mois</w:t>
+              <w:br/>
+              <w:t>d'immersion)</w:t>
+            </w:r>
+          </w:p>
+        </w:tc>
+        <w:tc>
+          <w:tcPr>
+            <w:tcW w:type="dxa" w:w="3041"/>
+            <w:tcW w:w="2551" w:type="dxa"/>
+            <w:shd w:val="clear" w:color="auto" w:fill="D6E4F0"/>
+          </w:tcPr>
+          <w:p>
+            <w:r>
+              <w:rPr>
+                <w:b/>
+                <w:color w:val="1E3C78"/>
+                <w:sz w:val="22"/>
               </w:rPr>
               <w:t>Jeunes allocataires</w:t>
             </w:r>
@@ -4552,16 +4606,16 @@
         </w:tc>
         <w:tc>
           <w:tcPr>
-            <w:tcW w:type="dxa" w:w="4561"/>
-          </w:tcPr>
-          <w:p>
-            <w:r/>
-            <w:r>
-              <w:rPr>
-                <w:color w:val="1A1A1A"/>
-                <w:sz w:val="19"/>
-              </w:rPr>
-              <w:t>Accès à un premier emploi formel rémunéré ; acquisition d'une expérience professionnelle encadrée ; développement des compétences métiers et transversales (déontologie, savoir-vivre, gestion de poste)</w:t>
+            <w:tcW w:type="dxa" w:w="3041"/>
+            <w:tcW w:w="5272" w:type="dxa"/>
+          </w:tcPr>
+          <w:p>
+            <w:r>
+              <w:rPr>
+                <w:b w:val="0"/>
+                <w:sz w:val="22"/>
+              </w:rPr>
+              <w:t>Accès à un premier emploi formel rémunéré ; acquisition d'une expérience professionnelle encadrée ; développement des compétences métiers et transversales</w:t>
             </w:r>
           </w:p>
         </w:tc>
@@ -4569,15 +4623,25 @@
       <w:tr>
         <w:tc>
           <w:tcPr>
-            <w:tcW w:type="dxa" w:w="4561"/>
-            <w:shd w:val="clear" w:color="auto" w:fill="EBF0FA"/>
-          </w:tcPr>
-          <w:p>
-            <w:r/>
-            <w:r>
-              <w:rPr>
-                <w:color w:val="1A1A1A"/>
-                <w:sz w:val="19"/>
+            <w:tcW w:type="dxa" w:w="3041"/>
+            <w:tcW w:w="2381" w:type="dxa"/>
+            <w:shd w:val="clear" w:color="auto" w:fill="2E75B6"/>
+            <w:vMerge/>
+          </w:tcPr>
+          <w:p/>
+        </w:tc>
+        <w:tc>
+          <w:tcPr>
+            <w:tcW w:type="dxa" w:w="3041"/>
+            <w:tcW w:w="2551" w:type="dxa"/>
+            <w:shd w:val="clear" w:color="auto" w:fill="D6E4F0"/>
+          </w:tcPr>
+          <w:p>
+            <w:r>
+              <w:rPr>
+                <w:b/>
+                <w:color w:val="1E3C78"/>
+                <w:sz w:val="22"/>
               </w:rPr>
               <w:t>Entreprises bénéficiaires</w:t>
             </w:r>
@@ -4585,17 +4649,16 @@
         </w:tc>
         <w:tc>
           <w:tcPr>
-            <w:tcW w:type="dxa" w:w="4561"/>
-            <w:shd w:val="clear" w:color="auto" w:fill="EBF0FA"/>
-          </w:tcPr>
-          <w:p>
-            <w:r/>
-            <w:r>
-              <w:rPr>
-                <w:color w:val="1A1A1A"/>
-                <w:sz w:val="19"/>
-              </w:rPr>
-              <w:t>Accès à des ressources humaines qualifiées à coût nul sur 24 mois ; amélioration de la productivité ; test des profils avant une éventuelle embauche permanente</w:t>
+            <w:tcW w:type="dxa" w:w="3041"/>
+            <w:tcW w:w="5272" w:type="dxa"/>
+          </w:tcPr>
+          <w:p>
+            <w:r>
+              <w:rPr>
+                <w:b w:val="0"/>
+                <w:sz w:val="22"/>
+              </w:rPr>
+              <w:t>Accès à des ressources humaines qualifiées à coût nul sur 24 mois ; amélioration de la productivité ; test des profils avant éventuelle embauche permanente</w:t>
             </w:r>
           </w:p>
         </w:tc>
@@ -4603,14 +4666,25 @@
       <w:tr>
         <w:tc>
           <w:tcPr>
-            <w:tcW w:type="dxa" w:w="4561"/>
-          </w:tcPr>
-          <w:p>
-            <w:r/>
-            <w:r>
-              <w:rPr>
-                <w:color w:val="1A1A1A"/>
-                <w:sz w:val="19"/>
+            <w:tcW w:type="dxa" w:w="3041"/>
+            <w:tcW w:w="2381" w:type="dxa"/>
+            <w:shd w:val="clear" w:color="auto" w:fill="2E75B6"/>
+            <w:vMerge/>
+          </w:tcPr>
+          <w:p/>
+        </w:tc>
+        <w:tc>
+          <w:tcPr>
+            <w:tcW w:type="dxa" w:w="3041"/>
+            <w:tcW w:w="2551" w:type="dxa"/>
+            <w:shd w:val="clear" w:color="auto" w:fill="D6E4F0"/>
+          </w:tcPr>
+          <w:p>
+            <w:r>
+              <w:rPr>
+                <w:b/>
+                <w:color w:val="1E3C78"/>
+                <w:sz w:val="22"/>
               </w:rPr>
               <w:t>Écosystème de l'emploi</w:t>
             </w:r>
@@ -4618,16 +4692,306 @@
         </w:tc>
         <w:tc>
           <w:tcPr>
-            <w:tcW w:type="dxa" w:w="4561"/>
-          </w:tcPr>
-          <w:p>
-            <w:r/>
-            <w:r>
-              <w:rPr>
-                <w:color w:val="1A1A1A"/>
-                <w:sz w:val="19"/>
-              </w:rPr>
-              <w:t>Dynamisation du marché de l'emploi formel ; visibilité accrue des offres grâce à la plateforme PSIE</w:t>
+            <w:tcW w:type="dxa" w:w="3041"/>
+            <w:tcW w:w="5272" w:type="dxa"/>
+          </w:tcPr>
+          <w:p>
+            <w:r>
+              <w:rPr>
+                <w:b w:val="0"/>
+                <w:sz w:val="22"/>
+              </w:rPr>
+              <w:t>Dynamisation du marché de l'emploi formel ; visibilité accrue des offres via la plateforme PSIE</w:t>
+            </w:r>
+          </w:p>
+        </w:tc>
+      </w:tr>
+      <w:tr>
+        <w:tc>
+          <w:tcPr>
+            <w:tcW w:type="dxa" w:w="3041"/>
+            <w:tcW w:w="2381" w:type="dxa"/>
+            <w:shd w:val="clear" w:color="auto" w:fill="2E6099"/>
+            <w:vMerge w:val="restart"/>
+          </w:tcPr>
+          <w:p>
+            <w:pPr>
+              <w:jc w:val="center"/>
+            </w:pPr>
+            <w:r>
+              <w:rPr>
+                <w:b/>
+                <w:color w:val="FFFFFF"/>
+                <w:sz w:val="20"/>
+              </w:rPr>
+              <w:t>Moyen terme</w:t>
+              <w:br/>
+              <w:t>(à la sortie du</w:t>
+              <w:br/>
+              <w:t>programme)</w:t>
+            </w:r>
+          </w:p>
+        </w:tc>
+        <w:tc>
+          <w:tcPr>
+            <w:tcW w:type="dxa" w:w="3041"/>
+            <w:tcW w:w="2551" w:type="dxa"/>
+            <w:shd w:val="clear" w:color="auto" w:fill="D6E9F8"/>
+          </w:tcPr>
+          <w:p>
+            <w:r>
+              <w:rPr>
+                <w:b/>
+                <w:color w:val="143264"/>
+                <w:sz w:val="22"/>
+              </w:rPr>
+              <w:t>Jeunes allocataires</w:t>
+            </w:r>
+          </w:p>
+        </w:tc>
+        <w:tc>
+          <w:tcPr>
+            <w:tcW w:type="dxa" w:w="3041"/>
+            <w:tcW w:w="5272" w:type="dxa"/>
+          </w:tcPr>
+          <w:p>
+            <w:r>
+              <w:rPr>
+                <w:b w:val="0"/>
+                <w:sz w:val="22"/>
+              </w:rPr>
+              <w:t>Amélioration de l'employabilité ; insertion durable en emploi salarié ou auto-emploi ; réduction du chômage de longue durée des diplômés</w:t>
+            </w:r>
+          </w:p>
+        </w:tc>
+      </w:tr>
+      <w:tr>
+        <w:tc>
+          <w:tcPr>
+            <w:tcW w:type="dxa" w:w="3041"/>
+            <w:tcW w:w="2381" w:type="dxa"/>
+            <w:shd w:val="clear" w:color="auto" w:fill="2E6099"/>
+            <w:vMerge/>
+          </w:tcPr>
+          <w:p/>
+        </w:tc>
+        <w:tc>
+          <w:tcPr>
+            <w:tcW w:type="dxa" w:w="3041"/>
+            <w:tcW w:w="2551" w:type="dxa"/>
+            <w:shd w:val="clear" w:color="auto" w:fill="D6E9F8"/>
+          </w:tcPr>
+          <w:p>
+            <w:r>
+              <w:rPr>
+                <w:b/>
+                <w:color w:val="143264"/>
+                <w:sz w:val="22"/>
+              </w:rPr>
+              <w:t>Entreprises</w:t>
+            </w:r>
+          </w:p>
+        </w:tc>
+        <w:tc>
+          <w:tcPr>
+            <w:tcW w:type="dxa" w:w="3041"/>
+            <w:tcW w:w="5272" w:type="dxa"/>
+          </w:tcPr>
+          <w:p>
+            <w:r>
+              <w:rPr>
+                <w:b w:val="0"/>
+                <w:sz w:val="22"/>
+              </w:rPr>
+              <w:t>Modification durable des comportements d'embauche (réduction de la réticence à recruter) ; renforcement des capacités RH</w:t>
+            </w:r>
+          </w:p>
+        </w:tc>
+      </w:tr>
+      <w:tr>
+        <w:tc>
+          <w:tcPr>
+            <w:tcW w:type="dxa" w:w="3041"/>
+            <w:tcW w:w="2381" w:type="dxa"/>
+            <w:shd w:val="clear" w:color="auto" w:fill="2E6099"/>
+            <w:vMerge/>
+          </w:tcPr>
+          <w:p/>
+        </w:tc>
+        <w:tc>
+          <w:tcPr>
+            <w:tcW w:type="dxa" w:w="3041"/>
+            <w:tcW w:w="2551" w:type="dxa"/>
+            <w:shd w:val="clear" w:color="auto" w:fill="D6E9F8"/>
+          </w:tcPr>
+          <w:p>
+            <w:r>
+              <w:rPr>
+                <w:b/>
+                <w:color w:val="143264"/>
+                <w:sz w:val="22"/>
+              </w:rPr>
+              <w:t>Marché du travail</w:t>
+            </w:r>
+          </w:p>
+        </w:tc>
+        <w:tc>
+          <w:tcPr>
+            <w:tcW w:type="dxa" w:w="3041"/>
+            <w:tcW w:w="5272" w:type="dxa"/>
+          </w:tcPr>
+          <w:p>
+            <w:r>
+              <w:rPr>
+                <w:b w:val="0"/>
+                <w:sz w:val="22"/>
+              </w:rPr>
+              <w:t>Réduction du taux de sous-emploi des jeunes ; augmentation du volume d'emplois formels</w:t>
+            </w:r>
+          </w:p>
+        </w:tc>
+      </w:tr>
+      <w:tr>
+        <w:tc>
+          <w:tcPr>
+            <w:tcW w:type="dxa" w:w="3041"/>
+            <w:tcW w:w="2381" w:type="dxa"/>
+            <w:shd w:val="clear" w:color="auto" w:fill="375623"/>
+            <w:vMerge w:val="restart"/>
+          </w:tcPr>
+          <w:p>
+            <w:pPr>
+              <w:jc w:val="center"/>
+            </w:pPr>
+            <w:r>
+              <w:rPr>
+                <w:b/>
+                <w:color w:val="FFFFFF"/>
+                <w:sz w:val="20"/>
+              </w:rPr>
+              <w:t>Long terme</w:t>
+              <w:br/>
+              <w:t>(3 à 5 ans après</w:t>
+              <w:br/>
+              <w:t>le programme)</w:t>
+            </w:r>
+          </w:p>
+        </w:tc>
+        <w:tc>
+          <w:tcPr>
+            <w:tcW w:type="dxa" w:w="3041"/>
+            <w:tcW w:w="2551" w:type="dxa"/>
+            <w:shd w:val="clear" w:color="auto" w:fill="D9ECD0"/>
+          </w:tcPr>
+          <w:p>
+            <w:r>
+              <w:rPr>
+                <w:b/>
+                <w:color w:val="28501E"/>
+                <w:sz w:val="22"/>
+              </w:rPr>
+              <w:t>Individuel</w:t>
+            </w:r>
+          </w:p>
+        </w:tc>
+        <w:tc>
+          <w:tcPr>
+            <w:tcW w:type="dxa" w:w="3041"/>
+            <w:tcW w:w="5272" w:type="dxa"/>
+          </w:tcPr>
+          <w:p>
+            <w:r>
+              <w:rPr>
+                <w:b w:val="0"/>
+                <w:sz w:val="22"/>
+              </w:rPr>
+              <w:t>Amélioration durable des revenus des anciens bénéficiaires ; réduction de la vulnérabilité économique des ménages</w:t>
+            </w:r>
+          </w:p>
+        </w:tc>
+      </w:tr>
+      <w:tr>
+        <w:tc>
+          <w:tcPr>
+            <w:tcW w:type="dxa" w:w="3041"/>
+            <w:tcW w:w="2381" w:type="dxa"/>
+            <w:shd w:val="clear" w:color="auto" w:fill="375623"/>
+            <w:vMerge/>
+          </w:tcPr>
+          <w:p/>
+        </w:tc>
+        <w:tc>
+          <w:tcPr>
+            <w:tcW w:type="dxa" w:w="3041"/>
+            <w:tcW w:w="2551" w:type="dxa"/>
+            <w:shd w:val="clear" w:color="auto" w:fill="D9ECD0"/>
+          </w:tcPr>
+          <w:p>
+            <w:r>
+              <w:rPr>
+                <w:b/>
+                <w:color w:val="28501E"/>
+                <w:sz w:val="22"/>
+              </w:rPr>
+              <w:t>Sectoriel</w:t>
+            </w:r>
+          </w:p>
+        </w:tc>
+        <w:tc>
+          <w:tcPr>
+            <w:tcW w:type="dxa" w:w="3041"/>
+            <w:tcW w:w="5272" w:type="dxa"/>
+          </w:tcPr>
+          <w:p>
+            <w:r>
+              <w:rPr>
+                <w:b w:val="0"/>
+                <w:sz w:val="22"/>
+              </w:rPr>
+              <w:t>Augmentation de la productivité dans les secteurs d'accueil ; diffusion d'une culture du travail qualifié dans les PME/PMI</w:t>
+            </w:r>
+          </w:p>
+        </w:tc>
+      </w:tr>
+      <w:tr>
+        <w:tc>
+          <w:tcPr>
+            <w:tcW w:type="dxa" w:w="3041"/>
+            <w:tcW w:w="2381" w:type="dxa"/>
+            <w:shd w:val="clear" w:color="auto" w:fill="375623"/>
+            <w:vMerge/>
+          </w:tcPr>
+          <w:p/>
+        </w:tc>
+        <w:tc>
+          <w:tcPr>
+            <w:tcW w:type="dxa" w:w="3041"/>
+            <w:tcW w:w="2551" w:type="dxa"/>
+            <w:shd w:val="clear" w:color="auto" w:fill="D9ECD0"/>
+          </w:tcPr>
+          <w:p>
+            <w:r>
+              <w:rPr>
+                <w:b/>
+                <w:color w:val="28501E"/>
+                <w:sz w:val="22"/>
+              </w:rPr>
+              <w:t>Macroéconomique</w:t>
+            </w:r>
+          </w:p>
+        </w:tc>
+        <w:tc>
+          <w:tcPr>
+            <w:tcW w:type="dxa" w:w="3041"/>
+            <w:tcW w:w="5272" w:type="dxa"/>
+          </w:tcPr>
+          <w:p>
+            <w:r>
+              <w:rPr>
+                <w:b w:val="0"/>
+                <w:sz w:val="22"/>
+              </w:rPr>
+              <w:t>Contribution à la réduction du taux de sous-emploi des jeunes (actuellement 72 %) ; appui aux objectifs du PAG sur la croissance inclusive</w:t>
             </w:r>
           </w:p>
         </w:tc>
@@ -4659,151 +5023,6 @@
         </w:rPr>
       </w:r>
     </w:p>
-    <w:tbl>
-      <w:tblPr>
-        <w:tblStyle w:val="TableGrid"/>
-        <w:tblW w:type="auto" w:w="0"/>
-        <w:tblLook w:firstColumn="1" w:firstRow="1" w:lastColumn="0" w:lastRow="0" w:noHBand="0" w:noVBand="1" w:val="04A0"/>
-      </w:tblPr>
-      <w:tblGrid>
-        <w:gridCol w:w="4561"/>
-        <w:gridCol w:w="4561"/>
-      </w:tblGrid>
-      <w:tr>
-        <w:tc>
-          <w:tcPr>
-            <w:tcW w:type="dxa" w:w="4561"/>
-            <w:shd w:val="clear" w:color="auto" w:fill="1A356E"/>
-          </w:tcPr>
-          <w:p>
-            <w:r/>
-            <w:r>
-              <w:rPr>
-                <w:b/>
-                <w:color w:val="FFFFFF"/>
-                <w:sz w:val="19"/>
-              </w:rPr>
-              <w:t>Bénéficiaire</w:t>
-            </w:r>
-          </w:p>
-        </w:tc>
-        <w:tc>
-          <w:tcPr>
-            <w:tcW w:type="dxa" w:w="4561"/>
-            <w:shd w:val="clear" w:color="auto" w:fill="1A356E"/>
-          </w:tcPr>
-          <w:p>
-            <w:r/>
-            <w:r>
-              <w:rPr>
-                <w:b/>
-                <w:color w:val="FFFFFF"/>
-                <w:sz w:val="19"/>
-              </w:rPr>
-              <w:t>Effet attendu</w:t>
-            </w:r>
-          </w:p>
-        </w:tc>
-      </w:tr>
-      <w:tr>
-        <w:tc>
-          <w:tcPr>
-            <w:tcW w:type="dxa" w:w="4561"/>
-          </w:tcPr>
-          <w:p>
-            <w:r/>
-            <w:r>
-              <w:rPr>
-                <w:color w:val="1A1A1A"/>
-                <w:sz w:val="19"/>
-              </w:rPr>
-              <w:t>Jeunes allocataires</w:t>
-            </w:r>
-          </w:p>
-        </w:tc>
-        <w:tc>
-          <w:tcPr>
-            <w:tcW w:type="dxa" w:w="4561"/>
-          </w:tcPr>
-          <w:p>
-            <w:r/>
-            <w:r>
-              <w:rPr>
-                <w:color w:val="1A1A1A"/>
-                <w:sz w:val="19"/>
-              </w:rPr>
-              <w:t>Amélioration de l'employabilité ; insertion durable dans l'emploi salarié ou dans l'auto-emploi ; réduction du chômage de longue durée des jeunes diplômés</w:t>
-            </w:r>
-          </w:p>
-        </w:tc>
-      </w:tr>
-      <w:tr>
-        <w:tc>
-          <w:tcPr>
-            <w:tcW w:type="dxa" w:w="4561"/>
-            <w:shd w:val="clear" w:color="auto" w:fill="EBF0FA"/>
-          </w:tcPr>
-          <w:p>
-            <w:r/>
-            <w:r>
-              <w:rPr>
-                <w:color w:val="1A1A1A"/>
-                <w:sz w:val="19"/>
-              </w:rPr>
-              <w:t>Entreprises bénéficiaires</w:t>
-            </w:r>
-          </w:p>
-        </w:tc>
-        <w:tc>
-          <w:tcPr>
-            <w:tcW w:type="dxa" w:w="4561"/>
-            <w:shd w:val="clear" w:color="auto" w:fill="EBF0FA"/>
-          </w:tcPr>
-          <w:p>
-            <w:r/>
-            <w:r>
-              <w:rPr>
-                <w:color w:val="1A1A1A"/>
-                <w:sz w:val="19"/>
-              </w:rPr>
-              <w:t>Modification durable des comportements d'embauche (réduction de la réticence à embaucher des jeunes qualifiés) ; renforcement des capacités de gestion des ressources humaines</w:t>
-            </w:r>
-          </w:p>
-        </w:tc>
-      </w:tr>
-      <w:tr>
-        <w:tc>
-          <w:tcPr>
-            <w:tcW w:type="dxa" w:w="4561"/>
-          </w:tcPr>
-          <w:p>
-            <w:r/>
-            <w:r>
-              <w:rPr>
-                <w:color w:val="1A1A1A"/>
-                <w:sz w:val="19"/>
-              </w:rPr>
-              <w:t>Marché du travail</w:t>
-            </w:r>
-          </w:p>
-        </w:tc>
-        <w:tc>
-          <w:tcPr>
-            <w:tcW w:type="dxa" w:w="4561"/>
-          </w:tcPr>
-          <w:p>
-            <w:r/>
-            <w:r>
-              <w:rPr>
-                <w:color w:val="1A1A1A"/>
-                <w:sz w:val="19"/>
-              </w:rPr>
-              <w:t>Réduction du taux de sous-emploi des jeunes ; augmentation du volume d'emplois formels</w:t>
-            </w:r>
-          </w:p>
-        </w:tc>
-      </w:tr>
-    </w:tbl>
     <w:p/>
     <w:p>
       <w:pPr>
@@ -4830,151 +5049,6 @@
         </w:rPr>
       </w:r>
     </w:p>
-    <w:tbl>
-      <w:tblPr>
-        <w:tblStyle w:val="TableGrid"/>
-        <w:tblW w:type="auto" w:w="0"/>
-        <w:tblLook w:firstColumn="1" w:firstRow="1" w:lastColumn="0" w:lastRow="0" w:noHBand="0" w:noVBand="1" w:val="04A0"/>
-      </w:tblPr>
-      <w:tblGrid>
-        <w:gridCol w:w="4561"/>
-        <w:gridCol w:w="4561"/>
-      </w:tblGrid>
-      <w:tr>
-        <w:tc>
-          <w:tcPr>
-            <w:tcW w:type="dxa" w:w="4561"/>
-            <w:shd w:val="clear" w:color="auto" w:fill="1A356E"/>
-          </w:tcPr>
-          <w:p>
-            <w:r/>
-            <w:r>
-              <w:rPr>
-                <w:b/>
-                <w:color w:val="FFFFFF"/>
-                <w:sz w:val="19"/>
-              </w:rPr>
-              <w:t>Niveau</w:t>
-            </w:r>
-          </w:p>
-        </w:tc>
-        <w:tc>
-          <w:tcPr>
-            <w:tcW w:type="dxa" w:w="4561"/>
-            <w:shd w:val="clear" w:color="auto" w:fill="1A356E"/>
-          </w:tcPr>
-          <w:p>
-            <w:r/>
-            <w:r>
-              <w:rPr>
-                <w:b/>
-                <w:color w:val="FFFFFF"/>
-                <w:sz w:val="19"/>
-              </w:rPr>
-              <w:t>Impact attendu</w:t>
-            </w:r>
-          </w:p>
-        </w:tc>
-      </w:tr>
-      <w:tr>
-        <w:tc>
-          <w:tcPr>
-            <w:tcW w:type="dxa" w:w="4561"/>
-          </w:tcPr>
-          <w:p>
-            <w:r/>
-            <w:r>
-              <w:rPr>
-                <w:color w:val="1A1A1A"/>
-                <w:sz w:val="19"/>
-              </w:rPr>
-              <w:t>Individuel</w:t>
-            </w:r>
-          </w:p>
-        </w:tc>
-        <w:tc>
-          <w:tcPr>
-            <w:tcW w:type="dxa" w:w="4561"/>
-          </w:tcPr>
-          <w:p>
-            <w:r/>
-            <w:r>
-              <w:rPr>
-                <w:color w:val="1A1A1A"/>
-                <w:sz w:val="19"/>
-              </w:rPr>
-              <w:t>Amélioration durable des revenus des anciens bénéficiaires ; réduction de la vulnérabilité économique des ménages</w:t>
-            </w:r>
-          </w:p>
-        </w:tc>
-      </w:tr>
-      <w:tr>
-        <w:tc>
-          <w:tcPr>
-            <w:tcW w:type="dxa" w:w="4561"/>
-            <w:shd w:val="clear" w:color="auto" w:fill="EBF0FA"/>
-          </w:tcPr>
-          <w:p>
-            <w:r/>
-            <w:r>
-              <w:rPr>
-                <w:color w:val="1A1A1A"/>
-                <w:sz w:val="19"/>
-              </w:rPr>
-              <w:t>Sectoriel</w:t>
-            </w:r>
-          </w:p>
-        </w:tc>
-        <w:tc>
-          <w:tcPr>
-            <w:tcW w:type="dxa" w:w="4561"/>
-            <w:shd w:val="clear" w:color="auto" w:fill="EBF0FA"/>
-          </w:tcPr>
-          <w:p>
-            <w:r/>
-            <w:r>
-              <w:rPr>
-                <w:color w:val="1A1A1A"/>
-                <w:sz w:val="19"/>
-              </w:rPr>
-              <w:t>Augmentation de la productivité dans les secteurs d'accueil ; diffusion d'une culture du travail qualifié dans les PME/PMI</w:t>
-            </w:r>
-          </w:p>
-        </w:tc>
-      </w:tr>
-      <w:tr>
-        <w:tc>
-          <w:tcPr>
-            <w:tcW w:type="dxa" w:w="4561"/>
-          </w:tcPr>
-          <w:p>
-            <w:r/>
-            <w:r>
-              <w:rPr>
-                <w:color w:val="1A1A1A"/>
-                <w:sz w:val="19"/>
-              </w:rPr>
-              <w:t>Macroéconomique</w:t>
-            </w:r>
-          </w:p>
-        </w:tc>
-        <w:tc>
-          <w:tcPr>
-            <w:tcW w:type="dxa" w:w="4561"/>
-          </w:tcPr>
-          <w:p>
-            <w:r/>
-            <w:r>
-              <w:rPr>
-                <w:color w:val="1A1A1A"/>
-                <w:sz w:val="19"/>
-              </w:rPr>
-              <w:t>Contribution à la réduction du taux de sous-emploi des jeunes (actuellement 72 %) ; appui à la réalisation des objectifs du PAG en matière de croissance économique inclusive</w:t>
-            </w:r>
-          </w:p>
-        </w:tc>
-      </w:tr>
-    </w:tbl>
     <w:p/>
     <w:p>
       <w:pPr>

</xml_diff>